<commit_message>
Upload User Research Plan doc
</commit_message>
<xml_diff>
--- a/Process Documents/Test Documents/System Level Testing 1.docx
+++ b/Process Documents/Test Documents/System Level Testing 1.docx
@@ -257,7 +257,7 @@
     </w:p>
     <w:tbl>
       <w:tblPr>
-        <w:tblW w:w="13603" w:type="dxa"/>
+        <w:tblW w:w="14999" w:type="dxa"/>
         <w:tblBorders>
           <w:top w:val="single" w:sz="4" w:space="0" w:color="auto"/>
           <w:left w:val="single" w:sz="4" w:space="0" w:color="auto"/>
@@ -276,9 +276,10 @@
         <w:tblLook w:val="04A0" w:firstRow="1" w:lastRow="0" w:firstColumn="1" w:lastColumn="0" w:noHBand="0" w:noVBand="1"/>
       </w:tblPr>
       <w:tblGrid>
-        <w:gridCol w:w="633"/>
-        <w:gridCol w:w="1391"/>
-        <w:gridCol w:w="1396"/>
+        <w:gridCol w:w="669"/>
+        <w:gridCol w:w="1435"/>
+        <w:gridCol w:w="755"/>
+        <w:gridCol w:w="1957"/>
         <w:gridCol w:w="1962"/>
         <w:gridCol w:w="1658"/>
         <w:gridCol w:w="1497"/>
@@ -318,7 +319,7 @@
         </w:tc>
         <w:tc>
           <w:tcPr>
-            <w:tcW w:w="0" w:type="auto"/>
+            <w:tcW w:w="1435" w:type="dxa"/>
             <w:shd w:val="clear" w:color="auto" w:fill="auto"/>
             <w:vAlign w:val="center"/>
             <w:hideMark/>
@@ -345,10 +346,7 @@
         </w:tc>
         <w:tc>
           <w:tcPr>
-            <w:tcW w:w="0" w:type="auto"/>
-            <w:shd w:val="clear" w:color="auto" w:fill="auto"/>
-            <w:vAlign w:val="center"/>
-            <w:hideMark/>
+            <w:tcW w:w="444" w:type="dxa"/>
           </w:tcPr>
           <w:p>
             <w:pPr>
@@ -366,13 +364,13 @@
                 <w:bCs/>
                 <w:lang w:val="en-US"/>
               </w:rPr>
-              <w:t>Input</w:t>
-            </w:r>
-          </w:p>
-        </w:tc>
-        <w:tc>
-          <w:tcPr>
-            <w:tcW w:w="1962" w:type="dxa"/>
+              <w:t>Initial state</w:t>
+            </w:r>
+          </w:p>
+        </w:tc>
+        <w:tc>
+          <w:tcPr>
+            <w:tcW w:w="0" w:type="auto"/>
             <w:shd w:val="clear" w:color="auto" w:fill="auto"/>
             <w:vAlign w:val="center"/>
             <w:hideMark/>
@@ -393,13 +391,13 @@
                 <w:bCs/>
                 <w:lang w:val="en-US"/>
               </w:rPr>
-              <w:t>Expected Outcome</w:t>
-            </w:r>
-          </w:p>
-        </w:tc>
-        <w:tc>
-          <w:tcPr>
-            <w:tcW w:w="1658" w:type="dxa"/>
+              <w:t>Input</w:t>
+            </w:r>
+          </w:p>
+        </w:tc>
+        <w:tc>
+          <w:tcPr>
+            <w:tcW w:w="1962" w:type="dxa"/>
             <w:shd w:val="clear" w:color="auto" w:fill="auto"/>
             <w:vAlign w:val="center"/>
             <w:hideMark/>
@@ -420,13 +418,13 @@
                 <w:bCs/>
                 <w:lang w:val="en-US"/>
               </w:rPr>
-              <w:t>Actual Outcome</w:t>
-            </w:r>
-          </w:p>
-        </w:tc>
-        <w:tc>
-          <w:tcPr>
-            <w:tcW w:w="1497" w:type="dxa"/>
+              <w:t>Expected Outcome</w:t>
+            </w:r>
+          </w:p>
+        </w:tc>
+        <w:tc>
+          <w:tcPr>
+            <w:tcW w:w="1658" w:type="dxa"/>
             <w:shd w:val="clear" w:color="auto" w:fill="auto"/>
             <w:vAlign w:val="center"/>
             <w:hideMark/>
@@ -447,13 +445,13 @@
                 <w:bCs/>
                 <w:lang w:val="en-US"/>
               </w:rPr>
-              <w:t>Pass/Fail</w:t>
-            </w:r>
-          </w:p>
-        </w:tc>
-        <w:tc>
-          <w:tcPr>
-            <w:tcW w:w="3067" w:type="dxa"/>
+              <w:t>Actual Outcome</w:t>
+            </w:r>
+          </w:p>
+        </w:tc>
+        <w:tc>
+          <w:tcPr>
+            <w:tcW w:w="1497" w:type="dxa"/>
             <w:shd w:val="clear" w:color="auto" w:fill="auto"/>
             <w:vAlign w:val="center"/>
             <w:hideMark/>
@@ -474,13 +472,13 @@
                 <w:bCs/>
                 <w:lang w:val="en-US"/>
               </w:rPr>
-              <w:t>What Next?</w:t>
-            </w:r>
-          </w:p>
-        </w:tc>
-        <w:tc>
-          <w:tcPr>
-            <w:tcW w:w="1999" w:type="dxa"/>
+              <w:t>Pass/Fail</w:t>
+            </w:r>
+          </w:p>
+        </w:tc>
+        <w:tc>
+          <w:tcPr>
+            <w:tcW w:w="3067" w:type="dxa"/>
             <w:shd w:val="clear" w:color="auto" w:fill="auto"/>
             <w:vAlign w:val="center"/>
             <w:hideMark/>
@@ -501,6 +499,33 @@
                 <w:bCs/>
                 <w:lang w:val="en-US"/>
               </w:rPr>
+              <w:t>What Next?</w:t>
+            </w:r>
+          </w:p>
+        </w:tc>
+        <w:tc>
+          <w:tcPr>
+            <w:tcW w:w="1999" w:type="dxa"/>
+            <w:shd w:val="clear" w:color="auto" w:fill="auto"/>
+            <w:vAlign w:val="center"/>
+            <w:hideMark/>
+          </w:tcPr>
+          <w:p>
+            <w:pPr>
+              <w:rPr>
+                <w:rFonts w:ascii="Arial" w:hAnsi="Arial" w:cs="Arial"/>
+                <w:b/>
+                <w:bCs/>
+                <w:lang w:val="en-US"/>
+              </w:rPr>
+            </w:pPr>
+            <w:r>
+              <w:rPr>
+                <w:rFonts w:ascii="Arial" w:hAnsi="Arial" w:cs="Arial"/>
+                <w:b/>
+                <w:bCs/>
+                <w:lang w:val="en-US"/>
+              </w:rPr>
               <w:t>Notes</w:t>
             </w:r>
           </w:p>
@@ -532,6 +557,42 @@
         </w:tc>
         <w:tc>
           <w:tcPr>
+            <w:tcW w:w="1435" w:type="dxa"/>
+            <w:shd w:val="clear" w:color="auto" w:fill="auto"/>
+            <w:vAlign w:val="center"/>
+            <w:hideMark/>
+          </w:tcPr>
+          <w:p>
+            <w:pPr>
+              <w:rPr>
+                <w:rFonts w:ascii="Arial" w:hAnsi="Arial" w:cs="Arial"/>
+                <w:lang w:val="en-US"/>
+              </w:rPr>
+            </w:pPr>
+            <w:r>
+              <w:rPr>
+                <w:rFonts w:ascii="Arial" w:hAnsi="Arial" w:cs="Arial"/>
+                <w:lang w:val="en-US"/>
+              </w:rPr>
+              <w:t>Game Initialization</w:t>
+            </w:r>
+          </w:p>
+        </w:tc>
+        <w:tc>
+          <w:tcPr>
+            <w:tcW w:w="444" w:type="dxa"/>
+          </w:tcPr>
+          <w:p>
+            <w:pPr>
+              <w:rPr>
+                <w:rFonts w:ascii="Arial" w:hAnsi="Arial" w:cs="Arial"/>
+                <w:lang w:val="en-US"/>
+              </w:rPr>
+            </w:pPr>
+          </w:p>
+        </w:tc>
+        <w:tc>
+          <w:tcPr>
             <w:tcW w:w="0" w:type="auto"/>
             <w:shd w:val="clear" w:color="auto" w:fill="auto"/>
             <w:vAlign w:val="center"/>
@@ -549,29 +610,6 @@
                 <w:rFonts w:ascii="Arial" w:hAnsi="Arial" w:cs="Arial"/>
                 <w:lang w:val="en-US"/>
               </w:rPr>
-              <w:t>Game Initialization</w:t>
-            </w:r>
-          </w:p>
-        </w:tc>
-        <w:tc>
-          <w:tcPr>
-            <w:tcW w:w="0" w:type="auto"/>
-            <w:shd w:val="clear" w:color="auto" w:fill="auto"/>
-            <w:vAlign w:val="center"/>
-            <w:hideMark/>
-          </w:tcPr>
-          <w:p>
-            <w:pPr>
-              <w:rPr>
-                <w:rFonts w:ascii="Arial" w:hAnsi="Arial" w:cs="Arial"/>
-                <w:lang w:val="en-US"/>
-              </w:rPr>
-            </w:pPr>
-            <w:r>
-              <w:rPr>
-                <w:rFonts w:ascii="Arial" w:hAnsi="Arial" w:cs="Arial"/>
-                <w:lang w:val="en-US"/>
-              </w:rPr>
               <w:t>Start a new game with 2 human players and 1 AI player</w:t>
             </w:r>
           </w:p>
@@ -661,21 +699,12 @@
                 <w:lang w:val="en-US"/>
               </w:rPr>
             </w:pPr>
-            <w:proofErr w:type="gramStart"/>
-            <w:r>
-              <w:rPr>
-                <w:rFonts w:ascii="Arial" w:hAnsi="Arial" w:cs="Arial"/>
-                <w:lang w:val="en-US"/>
-              </w:rPr>
-              <w:t>Test</w:t>
-            </w:r>
-            <w:proofErr w:type="gramEnd"/>
-            <w:r>
-              <w:rPr>
-                <w:rFonts w:ascii="Arial" w:hAnsi="Arial" w:cs="Arial"/>
-                <w:lang w:val="en-US"/>
-              </w:rPr>
-              <w:t xml:space="preserve"> bank limit is £50,000</w:t>
+            <w:r>
+              <w:rPr>
+                <w:rFonts w:ascii="Arial" w:hAnsi="Arial" w:cs="Arial"/>
+                <w:lang w:val="en-US"/>
+              </w:rPr>
+              <w:t>Test bank limit is £50,000</w:t>
             </w:r>
           </w:p>
         </w:tc>
@@ -706,6 +735,42 @@
         </w:tc>
         <w:tc>
           <w:tcPr>
+            <w:tcW w:w="1435" w:type="dxa"/>
+            <w:shd w:val="clear" w:color="auto" w:fill="auto"/>
+            <w:vAlign w:val="center"/>
+            <w:hideMark/>
+          </w:tcPr>
+          <w:p>
+            <w:pPr>
+              <w:rPr>
+                <w:rFonts w:ascii="Arial" w:hAnsi="Arial" w:cs="Arial"/>
+                <w:lang w:val="en-US"/>
+              </w:rPr>
+            </w:pPr>
+            <w:r>
+              <w:rPr>
+                <w:rFonts w:ascii="Arial" w:hAnsi="Arial" w:cs="Arial"/>
+                <w:lang w:val="en-US"/>
+              </w:rPr>
+              <w:t>Dice Rolling and Movement</w:t>
+            </w:r>
+          </w:p>
+        </w:tc>
+        <w:tc>
+          <w:tcPr>
+            <w:tcW w:w="444" w:type="dxa"/>
+          </w:tcPr>
+          <w:p>
+            <w:pPr>
+              <w:rPr>
+                <w:rFonts w:ascii="Arial" w:hAnsi="Arial" w:cs="Arial"/>
+                <w:lang w:val="en-US"/>
+              </w:rPr>
+            </w:pPr>
+          </w:p>
+        </w:tc>
+        <w:tc>
+          <w:tcPr>
             <w:tcW w:w="0" w:type="auto"/>
             <w:shd w:val="clear" w:color="auto" w:fill="auto"/>
             <w:vAlign w:val="center"/>
@@ -723,46 +788,7 @@
                 <w:rFonts w:ascii="Arial" w:hAnsi="Arial" w:cs="Arial"/>
                 <w:lang w:val="en-US"/>
               </w:rPr>
-              <w:t>Dice Rolling and Movement</w:t>
-            </w:r>
-          </w:p>
-        </w:tc>
-        <w:tc>
-          <w:tcPr>
-            <w:tcW w:w="0" w:type="auto"/>
-            <w:shd w:val="clear" w:color="auto" w:fill="auto"/>
-            <w:vAlign w:val="center"/>
-            <w:hideMark/>
-          </w:tcPr>
-          <w:p>
-            <w:pPr>
-              <w:rPr>
-                <w:rFonts w:ascii="Arial" w:hAnsi="Arial" w:cs="Arial"/>
-                <w:lang w:val="en-US"/>
-              </w:rPr>
-            </w:pPr>
-            <w:r>
-              <w:rPr>
-                <w:rFonts w:ascii="Arial" w:hAnsi="Arial" w:cs="Arial"/>
-                <w:lang w:val="en-US"/>
-              </w:rPr>
-              <w:t xml:space="preserve">Click </w:t>
-            </w:r>
-            <w:proofErr w:type="gramStart"/>
-            <w:r>
-              <w:rPr>
-                <w:rFonts w:ascii="Arial" w:hAnsi="Arial" w:cs="Arial"/>
-                <w:lang w:val="en-US"/>
-              </w:rPr>
-              <w:t>"Roll</w:t>
-            </w:r>
-            <w:proofErr w:type="gramEnd"/>
-            <w:r>
-              <w:rPr>
-                <w:rFonts w:ascii="Arial" w:hAnsi="Arial" w:cs="Arial"/>
-                <w:lang w:val="en-US"/>
-              </w:rPr>
-              <w:t>" button during player turn</w:t>
+              <w:t>Click "Roll" button during player turn</w:t>
             </w:r>
           </w:p>
         </w:tc>
@@ -887,6 +913,42 @@
         </w:tc>
         <w:tc>
           <w:tcPr>
+            <w:tcW w:w="1435" w:type="dxa"/>
+            <w:shd w:val="clear" w:color="auto" w:fill="auto"/>
+            <w:vAlign w:val="center"/>
+            <w:hideMark/>
+          </w:tcPr>
+          <w:p>
+            <w:pPr>
+              <w:rPr>
+                <w:rFonts w:ascii="Arial" w:hAnsi="Arial" w:cs="Arial"/>
+                <w:lang w:val="en-US"/>
+              </w:rPr>
+            </w:pPr>
+            <w:r>
+              <w:rPr>
+                <w:rFonts w:ascii="Arial" w:hAnsi="Arial" w:cs="Arial"/>
+                <w:lang w:val="en-US"/>
+              </w:rPr>
+              <w:t>Passing GO</w:t>
+            </w:r>
+          </w:p>
+        </w:tc>
+        <w:tc>
+          <w:tcPr>
+            <w:tcW w:w="444" w:type="dxa"/>
+          </w:tcPr>
+          <w:p>
+            <w:pPr>
+              <w:rPr>
+                <w:rFonts w:ascii="Arial" w:hAnsi="Arial" w:cs="Arial"/>
+                <w:lang w:val="en-US"/>
+              </w:rPr>
+            </w:pPr>
+          </w:p>
+        </w:tc>
+        <w:tc>
+          <w:tcPr>
             <w:tcW w:w="0" w:type="auto"/>
             <w:shd w:val="clear" w:color="auto" w:fill="auto"/>
             <w:vAlign w:val="center"/>
@@ -904,29 +966,6 @@
                 <w:rFonts w:ascii="Arial" w:hAnsi="Arial" w:cs="Arial"/>
                 <w:lang w:val="en-US"/>
               </w:rPr>
-              <w:t>Passing GO</w:t>
-            </w:r>
-          </w:p>
-        </w:tc>
-        <w:tc>
-          <w:tcPr>
-            <w:tcW w:w="0" w:type="auto"/>
-            <w:shd w:val="clear" w:color="auto" w:fill="auto"/>
-            <w:vAlign w:val="center"/>
-            <w:hideMark/>
-          </w:tcPr>
-          <w:p>
-            <w:pPr>
-              <w:rPr>
-                <w:rFonts w:ascii="Arial" w:hAnsi="Arial" w:cs="Arial"/>
-                <w:lang w:val="en-US"/>
-              </w:rPr>
-            </w:pPr>
-            <w:r>
-              <w:rPr>
-                <w:rFonts w:ascii="Arial" w:hAnsi="Arial" w:cs="Arial"/>
-                <w:lang w:val="en-US"/>
-              </w:rPr>
               <w:t>Move player across GO space</w:t>
             </w:r>
           </w:p>
@@ -945,37 +984,12 @@
                 <w:lang w:val="en-US"/>
               </w:rPr>
             </w:pPr>
-            <w:proofErr w:type="gramStart"/>
-            <w:r>
-              <w:rPr>
-                <w:rFonts w:ascii="Arial" w:hAnsi="Arial" w:cs="Arial"/>
-                <w:lang w:val="en-US"/>
-              </w:rPr>
-              <w:t>Player</w:t>
-            </w:r>
-            <w:proofErr w:type="gramEnd"/>
-            <w:r>
-              <w:rPr>
-                <w:rFonts w:ascii="Arial" w:hAnsi="Arial" w:cs="Arial"/>
-                <w:lang w:val="en-US"/>
-              </w:rPr>
-              <w:t xml:space="preserve"> should receive </w:t>
-            </w:r>
-            <w:proofErr w:type="gramStart"/>
-            <w:r>
-              <w:rPr>
-                <w:rFonts w:ascii="Arial" w:hAnsi="Arial" w:cs="Arial"/>
-                <w:lang w:val="en-US"/>
-              </w:rPr>
-              <w:t>£200,</w:t>
-            </w:r>
-            <w:proofErr w:type="gramEnd"/>
-            <w:r>
-              <w:rPr>
-                <w:rFonts w:ascii="Arial" w:hAnsi="Arial" w:cs="Arial"/>
-                <w:lang w:val="en-US"/>
-              </w:rPr>
-              <w:t xml:space="preserve"> lap counter should increment</w:t>
+            <w:r>
+              <w:rPr>
+                <w:rFonts w:ascii="Arial" w:hAnsi="Arial" w:cs="Arial"/>
+                <w:lang w:val="en-US"/>
+              </w:rPr>
+              <w:t>Player should receive £200, lap counter should increment</w:t>
             </w:r>
           </w:p>
         </w:tc>
@@ -1077,6 +1091,42 @@
         </w:tc>
         <w:tc>
           <w:tcPr>
+            <w:tcW w:w="1435" w:type="dxa"/>
+            <w:shd w:val="clear" w:color="auto" w:fill="auto"/>
+            <w:vAlign w:val="center"/>
+            <w:hideMark/>
+          </w:tcPr>
+          <w:p>
+            <w:pPr>
+              <w:rPr>
+                <w:rFonts w:ascii="Arial" w:hAnsi="Arial" w:cs="Arial"/>
+                <w:lang w:val="en-US"/>
+              </w:rPr>
+            </w:pPr>
+            <w:r>
+              <w:rPr>
+                <w:rFonts w:ascii="Arial" w:hAnsi="Arial" w:cs="Arial"/>
+                <w:lang w:val="en-US"/>
+              </w:rPr>
+              <w:t>Property Purchase</w:t>
+            </w:r>
+          </w:p>
+        </w:tc>
+        <w:tc>
+          <w:tcPr>
+            <w:tcW w:w="444" w:type="dxa"/>
+          </w:tcPr>
+          <w:p>
+            <w:pPr>
+              <w:rPr>
+                <w:rFonts w:ascii="Arial" w:hAnsi="Arial" w:cs="Arial"/>
+                <w:lang w:val="en-US"/>
+              </w:rPr>
+            </w:pPr>
+          </w:p>
+        </w:tc>
+        <w:tc>
+          <w:tcPr>
             <w:tcW w:w="0" w:type="auto"/>
             <w:shd w:val="clear" w:color="auto" w:fill="auto"/>
             <w:vAlign w:val="center"/>
@@ -1094,38 +1144,7 @@
                 <w:rFonts w:ascii="Arial" w:hAnsi="Arial" w:cs="Arial"/>
                 <w:lang w:val="en-US"/>
               </w:rPr>
-              <w:t>Property Purchase</w:t>
-            </w:r>
-          </w:p>
-        </w:tc>
-        <w:tc>
-          <w:tcPr>
-            <w:tcW w:w="0" w:type="auto"/>
-            <w:shd w:val="clear" w:color="auto" w:fill="auto"/>
-            <w:vAlign w:val="center"/>
-            <w:hideMark/>
-          </w:tcPr>
-          <w:p>
-            <w:pPr>
-              <w:rPr>
-                <w:rFonts w:ascii="Arial" w:hAnsi="Arial" w:cs="Arial"/>
-                <w:lang w:val="en-US"/>
-              </w:rPr>
-            </w:pPr>
-            <w:r>
-              <w:rPr>
-                <w:rFonts w:ascii="Arial" w:hAnsi="Arial" w:cs="Arial"/>
-                <w:lang w:val="en-US"/>
-              </w:rPr>
-              <w:t xml:space="preserve">Land on unowned property, </w:t>
-            </w:r>
-            <w:r>
-              <w:rPr>
-                <w:rFonts w:ascii="Arial" w:hAnsi="Arial" w:cs="Arial"/>
-                <w:lang w:val="en-US"/>
-              </w:rPr>
-              <w:lastRenderedPageBreak/>
-              <w:t>click "Buy" button</w:t>
+              <w:t>Land on unowned property, click "Buy" button</w:t>
             </w:r>
           </w:p>
         </w:tc>
@@ -1148,7 +1167,6 @@
                 <w:rFonts w:ascii="Arial" w:hAnsi="Arial" w:cs="Arial"/>
                 <w:lang w:val="en-US"/>
               </w:rPr>
-              <w:lastRenderedPageBreak/>
               <w:t xml:space="preserve">Player money should decrease by property price, </w:t>
             </w:r>
             <w:r>
@@ -1259,7 +1277,7 @@
         </w:tc>
         <w:tc>
           <w:tcPr>
-            <w:tcW w:w="0" w:type="auto"/>
+            <w:tcW w:w="1435" w:type="dxa"/>
             <w:shd w:val="clear" w:color="auto" w:fill="auto"/>
             <w:vAlign w:val="center"/>
             <w:hideMark/>
@@ -1278,6 +1296,19 @@
               </w:rPr>
               <w:t>Rent Payment</w:t>
             </w:r>
+          </w:p>
+        </w:tc>
+        <w:tc>
+          <w:tcPr>
+            <w:tcW w:w="444" w:type="dxa"/>
+          </w:tcPr>
+          <w:p>
+            <w:pPr>
+              <w:rPr>
+                <w:rFonts w:ascii="Arial" w:hAnsi="Arial" w:cs="Arial"/>
+                <w:lang w:val="en-US"/>
+              </w:rPr>
+            </w:pPr>
           </w:p>
         </w:tc>
         <w:tc>
@@ -1424,6 +1455,42 @@
         </w:tc>
         <w:tc>
           <w:tcPr>
+            <w:tcW w:w="1435" w:type="dxa"/>
+            <w:shd w:val="clear" w:color="auto" w:fill="auto"/>
+            <w:vAlign w:val="center"/>
+            <w:hideMark/>
+          </w:tcPr>
+          <w:p>
+            <w:pPr>
+              <w:rPr>
+                <w:rFonts w:ascii="Arial" w:hAnsi="Arial" w:cs="Arial"/>
+                <w:lang w:val="en-US"/>
+              </w:rPr>
+            </w:pPr>
+            <w:r>
+              <w:rPr>
+                <w:rFonts w:ascii="Arial" w:hAnsi="Arial" w:cs="Arial"/>
+                <w:lang w:val="en-US"/>
+              </w:rPr>
+              <w:t>Auction System</w:t>
+            </w:r>
+          </w:p>
+        </w:tc>
+        <w:tc>
+          <w:tcPr>
+            <w:tcW w:w="444" w:type="dxa"/>
+          </w:tcPr>
+          <w:p>
+            <w:pPr>
+              <w:rPr>
+                <w:rFonts w:ascii="Arial" w:hAnsi="Arial" w:cs="Arial"/>
+                <w:lang w:val="en-US"/>
+              </w:rPr>
+            </w:pPr>
+          </w:p>
+        </w:tc>
+        <w:tc>
+          <w:tcPr>
             <w:tcW w:w="0" w:type="auto"/>
             <w:shd w:val="clear" w:color="auto" w:fill="auto"/>
             <w:vAlign w:val="center"/>
@@ -1441,29 +1508,6 @@
                 <w:rFonts w:ascii="Arial" w:hAnsi="Arial" w:cs="Arial"/>
                 <w:lang w:val="en-US"/>
               </w:rPr>
-              <w:t>Auction System</w:t>
-            </w:r>
-          </w:p>
-        </w:tc>
-        <w:tc>
-          <w:tcPr>
-            <w:tcW w:w="0" w:type="auto"/>
-            <w:shd w:val="clear" w:color="auto" w:fill="auto"/>
-            <w:vAlign w:val="center"/>
-            <w:hideMark/>
-          </w:tcPr>
-          <w:p>
-            <w:pPr>
-              <w:rPr>
-                <w:rFonts w:ascii="Arial" w:hAnsi="Arial" w:cs="Arial"/>
-                <w:lang w:val="en-US"/>
-              </w:rPr>
-            </w:pPr>
-            <w:r>
-              <w:rPr>
-                <w:rFonts w:ascii="Arial" w:hAnsi="Arial" w:cs="Arial"/>
-                <w:lang w:val="en-US"/>
-              </w:rPr>
               <w:t>Decline to purchase property when landing on it</w:t>
             </w:r>
           </w:p>
@@ -1482,21 +1526,12 @@
                 <w:lang w:val="en-US"/>
               </w:rPr>
             </w:pPr>
-            <w:proofErr w:type="gramStart"/>
-            <w:r>
-              <w:rPr>
-                <w:rFonts w:ascii="Arial" w:hAnsi="Arial" w:cs="Arial"/>
-                <w:lang w:val="en-US"/>
-              </w:rPr>
-              <w:t>Auction</w:t>
-            </w:r>
-            <w:proofErr w:type="gramEnd"/>
-            <w:r>
-              <w:rPr>
-                <w:rFonts w:ascii="Arial" w:hAnsi="Arial" w:cs="Arial"/>
-                <w:lang w:val="en-US"/>
-              </w:rPr>
-              <w:t xml:space="preserve"> interface should appear, all players should be able to bid</w:t>
+            <w:r>
+              <w:rPr>
+                <w:rFonts w:ascii="Arial" w:hAnsi="Arial" w:cs="Arial"/>
+                <w:lang w:val="en-US"/>
+              </w:rPr>
+              <w:t>Auction interface should appear, all players should be able to bid</w:t>
             </w:r>
           </w:p>
         </w:tc>
@@ -1598,6 +1633,42 @@
         </w:tc>
         <w:tc>
           <w:tcPr>
+            <w:tcW w:w="1435" w:type="dxa"/>
+            <w:shd w:val="clear" w:color="auto" w:fill="auto"/>
+            <w:vAlign w:val="center"/>
+            <w:hideMark/>
+          </w:tcPr>
+          <w:p>
+            <w:pPr>
+              <w:rPr>
+                <w:rFonts w:ascii="Arial" w:hAnsi="Arial" w:cs="Arial"/>
+                <w:lang w:val="en-US"/>
+              </w:rPr>
+            </w:pPr>
+            <w:r>
+              <w:rPr>
+                <w:rFonts w:ascii="Arial" w:hAnsi="Arial" w:cs="Arial"/>
+                <w:lang w:val="en-US"/>
+              </w:rPr>
+              <w:t>Card Drawing</w:t>
+            </w:r>
+          </w:p>
+        </w:tc>
+        <w:tc>
+          <w:tcPr>
+            <w:tcW w:w="444" w:type="dxa"/>
+          </w:tcPr>
+          <w:p>
+            <w:pPr>
+              <w:rPr>
+                <w:rFonts w:ascii="Arial" w:hAnsi="Arial" w:cs="Arial"/>
+                <w:lang w:val="en-US"/>
+              </w:rPr>
+            </w:pPr>
+          </w:p>
+        </w:tc>
+        <w:tc>
+          <w:tcPr>
             <w:tcW w:w="0" w:type="auto"/>
             <w:shd w:val="clear" w:color="auto" w:fill="auto"/>
             <w:vAlign w:val="center"/>
@@ -1615,46 +1686,7 @@
                 <w:rFonts w:ascii="Arial" w:hAnsi="Arial" w:cs="Arial"/>
                 <w:lang w:val="en-US"/>
               </w:rPr>
-              <w:t>Card Drawing</w:t>
-            </w:r>
-          </w:p>
-        </w:tc>
-        <w:tc>
-          <w:tcPr>
-            <w:tcW w:w="0" w:type="auto"/>
-            <w:shd w:val="clear" w:color="auto" w:fill="auto"/>
-            <w:vAlign w:val="center"/>
-            <w:hideMark/>
-          </w:tcPr>
-          <w:p>
-            <w:pPr>
-              <w:rPr>
-                <w:rFonts w:ascii="Arial" w:hAnsi="Arial" w:cs="Arial"/>
-                <w:lang w:val="en-US"/>
-              </w:rPr>
-            </w:pPr>
-            <w:r>
-              <w:rPr>
-                <w:rFonts w:ascii="Arial" w:hAnsi="Arial" w:cs="Arial"/>
-                <w:lang w:val="en-US"/>
-              </w:rPr>
-              <w:t>Land on "</w:t>
-            </w:r>
-            <w:proofErr w:type="gramStart"/>
-            <w:r>
-              <w:rPr>
-                <w:rFonts w:ascii="Arial" w:hAnsi="Arial" w:cs="Arial"/>
-                <w:lang w:val="en-US"/>
-              </w:rPr>
-              <w:t>Pot Luck</w:t>
-            </w:r>
-            <w:proofErr w:type="gramEnd"/>
-            <w:r>
-              <w:rPr>
-                <w:rFonts w:ascii="Arial" w:hAnsi="Arial" w:cs="Arial"/>
-                <w:lang w:val="en-US"/>
-              </w:rPr>
-              <w:t>" or "Opportunity Knocks" spaces</w:t>
+              <w:t>Land on "Pot Luck" or "Opportunity Knocks" spaces</w:t>
             </w:r>
           </w:p>
         </w:tc>
@@ -1779,6 +1811,42 @@
         </w:tc>
         <w:tc>
           <w:tcPr>
+            <w:tcW w:w="1435" w:type="dxa"/>
+            <w:shd w:val="clear" w:color="auto" w:fill="auto"/>
+            <w:vAlign w:val="center"/>
+            <w:hideMark/>
+          </w:tcPr>
+          <w:p>
+            <w:pPr>
+              <w:rPr>
+                <w:rFonts w:ascii="Arial" w:hAnsi="Arial" w:cs="Arial"/>
+                <w:lang w:val="en-US"/>
+              </w:rPr>
+            </w:pPr>
+            <w:r>
+              <w:rPr>
+                <w:rFonts w:ascii="Arial" w:hAnsi="Arial" w:cs="Arial"/>
+                <w:lang w:val="en-US"/>
+              </w:rPr>
+              <w:t>Jail Mechanics</w:t>
+            </w:r>
+          </w:p>
+        </w:tc>
+        <w:tc>
+          <w:tcPr>
+            <w:tcW w:w="444" w:type="dxa"/>
+          </w:tcPr>
+          <w:p>
+            <w:pPr>
+              <w:rPr>
+                <w:rFonts w:ascii="Arial" w:hAnsi="Arial" w:cs="Arial"/>
+                <w:lang w:val="en-US"/>
+              </w:rPr>
+            </w:pPr>
+          </w:p>
+        </w:tc>
+        <w:tc>
+          <w:tcPr>
             <w:tcW w:w="0" w:type="auto"/>
             <w:shd w:val="clear" w:color="auto" w:fill="auto"/>
             <w:vAlign w:val="center"/>
@@ -1796,29 +1864,6 @@
                 <w:rFonts w:ascii="Arial" w:hAnsi="Arial" w:cs="Arial"/>
                 <w:lang w:val="en-US"/>
               </w:rPr>
-              <w:t>Jail Mechanics</w:t>
-            </w:r>
-          </w:p>
-        </w:tc>
-        <w:tc>
-          <w:tcPr>
-            <w:tcW w:w="0" w:type="auto"/>
-            <w:shd w:val="clear" w:color="auto" w:fill="auto"/>
-            <w:vAlign w:val="center"/>
-            <w:hideMark/>
-          </w:tcPr>
-          <w:p>
-            <w:pPr>
-              <w:rPr>
-                <w:rFonts w:ascii="Arial" w:hAnsi="Arial" w:cs="Arial"/>
-                <w:lang w:val="en-US"/>
-              </w:rPr>
-            </w:pPr>
-            <w:r>
-              <w:rPr>
-                <w:rFonts w:ascii="Arial" w:hAnsi="Arial" w:cs="Arial"/>
-                <w:lang w:val="en-US"/>
-              </w:rPr>
               <w:t>Roll three consecutive doubles or land on "Go to Jail"</w:t>
             </w:r>
           </w:p>
@@ -1837,21 +1882,12 @@
                 <w:lang w:val="en-US"/>
               </w:rPr>
             </w:pPr>
-            <w:proofErr w:type="gramStart"/>
-            <w:r>
-              <w:rPr>
-                <w:rFonts w:ascii="Arial" w:hAnsi="Arial" w:cs="Arial"/>
-                <w:lang w:val="en-US"/>
-              </w:rPr>
-              <w:t>Player</w:t>
-            </w:r>
-            <w:proofErr w:type="gramEnd"/>
-            <w:r>
-              <w:rPr>
-                <w:rFonts w:ascii="Arial" w:hAnsi="Arial" w:cs="Arial"/>
-                <w:lang w:val="en-US"/>
-              </w:rPr>
-              <w:t xml:space="preserve"> should move to jail, miss turns until conditions met</w:t>
+            <w:r>
+              <w:rPr>
+                <w:rFonts w:ascii="Arial" w:hAnsi="Arial" w:cs="Arial"/>
+                <w:lang w:val="en-US"/>
+              </w:rPr>
+              <w:t>Player should move to jail, miss turns until conditions met</w:t>
             </w:r>
           </w:p>
         </w:tc>
@@ -1953,6 +1989,42 @@
         </w:tc>
         <w:tc>
           <w:tcPr>
+            <w:tcW w:w="1435" w:type="dxa"/>
+            <w:shd w:val="clear" w:color="auto" w:fill="auto"/>
+            <w:vAlign w:val="center"/>
+            <w:hideMark/>
+          </w:tcPr>
+          <w:p>
+            <w:pPr>
+              <w:rPr>
+                <w:rFonts w:ascii="Arial" w:hAnsi="Arial" w:cs="Arial"/>
+                <w:lang w:val="en-US"/>
+              </w:rPr>
+            </w:pPr>
+            <w:r>
+              <w:rPr>
+                <w:rFonts w:ascii="Arial" w:hAnsi="Arial" w:cs="Arial"/>
+                <w:lang w:val="en-US"/>
+              </w:rPr>
+              <w:t>Free Parking</w:t>
+            </w:r>
+          </w:p>
+        </w:tc>
+        <w:tc>
+          <w:tcPr>
+            <w:tcW w:w="444" w:type="dxa"/>
+          </w:tcPr>
+          <w:p>
+            <w:pPr>
+              <w:rPr>
+                <w:rFonts w:ascii="Arial" w:hAnsi="Arial" w:cs="Arial"/>
+                <w:lang w:val="en-US"/>
+              </w:rPr>
+            </w:pPr>
+          </w:p>
+        </w:tc>
+        <w:tc>
+          <w:tcPr>
             <w:tcW w:w="0" w:type="auto"/>
             <w:shd w:val="clear" w:color="auto" w:fill="auto"/>
             <w:vAlign w:val="center"/>
@@ -1970,29 +2042,6 @@
                 <w:rFonts w:ascii="Arial" w:hAnsi="Arial" w:cs="Arial"/>
                 <w:lang w:val="en-US"/>
               </w:rPr>
-              <w:t>Free Parking</w:t>
-            </w:r>
-          </w:p>
-        </w:tc>
-        <w:tc>
-          <w:tcPr>
-            <w:tcW w:w="0" w:type="auto"/>
-            <w:shd w:val="clear" w:color="auto" w:fill="auto"/>
-            <w:vAlign w:val="center"/>
-            <w:hideMark/>
-          </w:tcPr>
-          <w:p>
-            <w:pPr>
-              <w:rPr>
-                <w:rFonts w:ascii="Arial" w:hAnsi="Arial" w:cs="Arial"/>
-                <w:lang w:val="en-US"/>
-              </w:rPr>
-            </w:pPr>
-            <w:r>
-              <w:rPr>
-                <w:rFonts w:ascii="Arial" w:hAnsi="Arial" w:cs="Arial"/>
-                <w:lang w:val="en-US"/>
-              </w:rPr>
               <w:t>Land on Free Parking space</w:t>
             </w:r>
           </w:p>
@@ -2011,29 +2060,12 @@
                 <w:lang w:val="en-US"/>
               </w:rPr>
             </w:pPr>
-            <w:proofErr w:type="gramStart"/>
-            <w:r>
-              <w:rPr>
-                <w:rFonts w:ascii="Arial" w:hAnsi="Arial" w:cs="Arial"/>
-                <w:lang w:val="en-US"/>
-              </w:rPr>
-              <w:t>Player</w:t>
-            </w:r>
-            <w:proofErr w:type="gramEnd"/>
-            <w:r>
-              <w:rPr>
-                <w:rFonts w:ascii="Arial" w:hAnsi="Arial" w:cs="Arial"/>
-                <w:lang w:val="en-US"/>
-              </w:rPr>
-              <w:t xml:space="preserve"> should collect accumulated fine </w:t>
-            </w:r>
-            <w:r>
-              <w:rPr>
-                <w:rFonts w:ascii="Arial" w:hAnsi="Arial" w:cs="Arial"/>
-                <w:lang w:val="en-US"/>
-              </w:rPr>
-              <w:lastRenderedPageBreak/>
-              <w:t>money (if house rule enabled)</w:t>
+            <w:r>
+              <w:rPr>
+                <w:rFonts w:ascii="Arial" w:hAnsi="Arial" w:cs="Arial"/>
+                <w:lang w:val="en-US"/>
+              </w:rPr>
+              <w:t>Player should collect accumulated fine money (if house rule enabled)</w:t>
             </w:r>
           </w:p>
         </w:tc>
@@ -2135,6 +2167,42 @@
         </w:tc>
         <w:tc>
           <w:tcPr>
+            <w:tcW w:w="1435" w:type="dxa"/>
+            <w:shd w:val="clear" w:color="auto" w:fill="auto"/>
+            <w:vAlign w:val="center"/>
+            <w:hideMark/>
+          </w:tcPr>
+          <w:p>
+            <w:pPr>
+              <w:rPr>
+                <w:rFonts w:ascii="Arial" w:hAnsi="Arial" w:cs="Arial"/>
+                <w:lang w:val="en-US"/>
+              </w:rPr>
+            </w:pPr>
+            <w:r>
+              <w:rPr>
+                <w:rFonts w:ascii="Arial" w:hAnsi="Arial" w:cs="Arial"/>
+                <w:lang w:val="en-US"/>
+              </w:rPr>
+              <w:t>House Building</w:t>
+            </w:r>
+          </w:p>
+        </w:tc>
+        <w:tc>
+          <w:tcPr>
+            <w:tcW w:w="444" w:type="dxa"/>
+          </w:tcPr>
+          <w:p>
+            <w:pPr>
+              <w:rPr>
+                <w:rFonts w:ascii="Arial" w:hAnsi="Arial" w:cs="Arial"/>
+                <w:lang w:val="en-US"/>
+              </w:rPr>
+            </w:pPr>
+          </w:p>
+        </w:tc>
+        <w:tc>
+          <w:tcPr>
             <w:tcW w:w="0" w:type="auto"/>
             <w:shd w:val="clear" w:color="auto" w:fill="auto"/>
             <w:vAlign w:val="center"/>
@@ -2152,30 +2220,15 @@
                 <w:rFonts w:ascii="Arial" w:hAnsi="Arial" w:cs="Arial"/>
                 <w:lang w:val="en-US"/>
               </w:rPr>
-              <w:t>House Building</w:t>
-            </w:r>
-          </w:p>
-        </w:tc>
-        <w:tc>
-          <w:tcPr>
-            <w:tcW w:w="0" w:type="auto"/>
-            <w:shd w:val="clear" w:color="auto" w:fill="auto"/>
-            <w:vAlign w:val="center"/>
-            <w:hideMark/>
-          </w:tcPr>
-          <w:p>
-            <w:pPr>
-              <w:rPr>
-                <w:rFonts w:ascii="Arial" w:hAnsi="Arial" w:cs="Arial"/>
-                <w:lang w:val="en-US"/>
-              </w:rPr>
-            </w:pPr>
-            <w:r>
-              <w:rPr>
-                <w:rFonts w:ascii="Arial" w:hAnsi="Arial" w:cs="Arial"/>
-                <w:lang w:val="en-US"/>
-              </w:rPr>
-              <w:t>Select a property from a complete set, click "Build House"</w:t>
+              <w:t xml:space="preserve">Select a property from a complete </w:t>
+            </w:r>
+            <w:r>
+              <w:rPr>
+                <w:rFonts w:ascii="Arial" w:hAnsi="Arial" w:cs="Arial"/>
+                <w:lang w:val="en-US"/>
+              </w:rPr>
+              <w:lastRenderedPageBreak/>
+              <w:t>set, click "Build House"</w:t>
             </w:r>
           </w:p>
         </w:tc>
@@ -2198,7 +2251,16 @@
                 <w:rFonts w:ascii="Arial" w:hAnsi="Arial" w:cs="Arial"/>
                 <w:lang w:val="en-US"/>
               </w:rPr>
-              <w:t>House should be added to property, rent values should increase</w:t>
+              <w:lastRenderedPageBreak/>
+              <w:t xml:space="preserve">House should be added to property, rent </w:t>
+            </w:r>
+            <w:r>
+              <w:rPr>
+                <w:rFonts w:ascii="Arial" w:hAnsi="Arial" w:cs="Arial"/>
+                <w:lang w:val="en-US"/>
+              </w:rPr>
+              <w:lastRenderedPageBreak/>
+              <w:t>values should increase</w:t>
             </w:r>
           </w:p>
         </w:tc>
@@ -2300,6 +2362,42 @@
         </w:tc>
         <w:tc>
           <w:tcPr>
+            <w:tcW w:w="1435" w:type="dxa"/>
+            <w:shd w:val="clear" w:color="auto" w:fill="auto"/>
+            <w:vAlign w:val="center"/>
+            <w:hideMark/>
+          </w:tcPr>
+          <w:p>
+            <w:pPr>
+              <w:rPr>
+                <w:rFonts w:ascii="Arial" w:hAnsi="Arial" w:cs="Arial"/>
+                <w:lang w:val="en-US"/>
+              </w:rPr>
+            </w:pPr>
+            <w:r>
+              <w:rPr>
+                <w:rFonts w:ascii="Arial" w:hAnsi="Arial" w:cs="Arial"/>
+                <w:lang w:val="en-US"/>
+              </w:rPr>
+              <w:t>Bankruptcy Handling</w:t>
+            </w:r>
+          </w:p>
+        </w:tc>
+        <w:tc>
+          <w:tcPr>
+            <w:tcW w:w="444" w:type="dxa"/>
+          </w:tcPr>
+          <w:p>
+            <w:pPr>
+              <w:rPr>
+                <w:rFonts w:ascii="Arial" w:hAnsi="Arial" w:cs="Arial"/>
+                <w:lang w:val="en-US"/>
+              </w:rPr>
+            </w:pPr>
+          </w:p>
+        </w:tc>
+        <w:tc>
+          <w:tcPr>
             <w:tcW w:w="0" w:type="auto"/>
             <w:shd w:val="clear" w:color="auto" w:fill="auto"/>
             <w:vAlign w:val="center"/>
@@ -2317,46 +2415,7 @@
                 <w:rFonts w:ascii="Arial" w:hAnsi="Arial" w:cs="Arial"/>
                 <w:lang w:val="en-US"/>
               </w:rPr>
-              <w:t>Bankruptcy Handling</w:t>
-            </w:r>
-          </w:p>
-        </w:tc>
-        <w:tc>
-          <w:tcPr>
-            <w:tcW w:w="0" w:type="auto"/>
-            <w:shd w:val="clear" w:color="auto" w:fill="auto"/>
-            <w:vAlign w:val="center"/>
-            <w:hideMark/>
-          </w:tcPr>
-          <w:p>
-            <w:pPr>
-              <w:rPr>
-                <w:rFonts w:ascii="Arial" w:hAnsi="Arial" w:cs="Arial"/>
-                <w:lang w:val="en-US"/>
-              </w:rPr>
-            </w:pPr>
-            <w:r>
-              <w:rPr>
-                <w:rFonts w:ascii="Arial" w:hAnsi="Arial" w:cs="Arial"/>
-                <w:lang w:val="en-US"/>
-              </w:rPr>
-              <w:t xml:space="preserve">Force </w:t>
-            </w:r>
-            <w:proofErr w:type="gramStart"/>
-            <w:r>
-              <w:rPr>
-                <w:rFonts w:ascii="Arial" w:hAnsi="Arial" w:cs="Arial"/>
-                <w:lang w:val="en-US"/>
-              </w:rPr>
-              <w:t>player</w:t>
-            </w:r>
-            <w:proofErr w:type="gramEnd"/>
-            <w:r>
-              <w:rPr>
-                <w:rFonts w:ascii="Arial" w:hAnsi="Arial" w:cs="Arial"/>
-                <w:lang w:val="en-US"/>
-              </w:rPr>
-              <w:t xml:space="preserve"> to pay more money than they have</w:t>
+              <w:t>Force player to pay more money than they have</w:t>
             </w:r>
           </w:p>
         </w:tc>
@@ -2374,21 +2433,12 @@
                 <w:lang w:val="en-US"/>
               </w:rPr>
             </w:pPr>
-            <w:proofErr w:type="gramStart"/>
-            <w:r>
-              <w:rPr>
-                <w:rFonts w:ascii="Arial" w:hAnsi="Arial" w:cs="Arial"/>
-                <w:lang w:val="en-US"/>
-              </w:rPr>
-              <w:t>Player</w:t>
-            </w:r>
-            <w:proofErr w:type="gramEnd"/>
-            <w:r>
-              <w:rPr>
-                <w:rFonts w:ascii="Arial" w:hAnsi="Arial" w:cs="Arial"/>
-                <w:lang w:val="en-US"/>
-              </w:rPr>
-              <w:t xml:space="preserve"> should go bankrupt, assets transferred to creditor</w:t>
+            <w:r>
+              <w:rPr>
+                <w:rFonts w:ascii="Arial" w:hAnsi="Arial" w:cs="Arial"/>
+                <w:lang w:val="en-US"/>
+              </w:rPr>
+              <w:t>Player should go bankrupt, assets transferred to creditor</w:t>
             </w:r>
           </w:p>
         </w:tc>
@@ -2490,6 +2540,42 @@
         </w:tc>
         <w:tc>
           <w:tcPr>
+            <w:tcW w:w="1435" w:type="dxa"/>
+            <w:shd w:val="clear" w:color="auto" w:fill="auto"/>
+            <w:vAlign w:val="center"/>
+            <w:hideMark/>
+          </w:tcPr>
+          <w:p>
+            <w:pPr>
+              <w:rPr>
+                <w:rFonts w:ascii="Arial" w:hAnsi="Arial" w:cs="Arial"/>
+                <w:lang w:val="en-US"/>
+              </w:rPr>
+            </w:pPr>
+            <w:r>
+              <w:rPr>
+                <w:rFonts w:ascii="Arial" w:hAnsi="Arial" w:cs="Arial"/>
+                <w:lang w:val="en-US"/>
+              </w:rPr>
+              <w:t>AI Player Turn Processing</w:t>
+            </w:r>
+          </w:p>
+        </w:tc>
+        <w:tc>
+          <w:tcPr>
+            <w:tcW w:w="444" w:type="dxa"/>
+          </w:tcPr>
+          <w:p>
+            <w:pPr>
+              <w:rPr>
+                <w:rFonts w:ascii="Arial" w:hAnsi="Arial" w:cs="Arial"/>
+                <w:lang w:val="en-US"/>
+              </w:rPr>
+            </w:pPr>
+          </w:p>
+        </w:tc>
+        <w:tc>
+          <w:tcPr>
             <w:tcW w:w="0" w:type="auto"/>
             <w:shd w:val="clear" w:color="auto" w:fill="auto"/>
             <w:vAlign w:val="center"/>
@@ -2507,29 +2593,6 @@
                 <w:rFonts w:ascii="Arial" w:hAnsi="Arial" w:cs="Arial"/>
                 <w:lang w:val="en-US"/>
               </w:rPr>
-              <w:t>AI Player Turn Processing</w:t>
-            </w:r>
-          </w:p>
-        </w:tc>
-        <w:tc>
-          <w:tcPr>
-            <w:tcW w:w="0" w:type="auto"/>
-            <w:shd w:val="clear" w:color="auto" w:fill="auto"/>
-            <w:vAlign w:val="center"/>
-            <w:hideMark/>
-          </w:tcPr>
-          <w:p>
-            <w:pPr>
-              <w:rPr>
-                <w:rFonts w:ascii="Arial" w:hAnsi="Arial" w:cs="Arial"/>
-                <w:lang w:val="en-US"/>
-              </w:rPr>
-            </w:pPr>
-            <w:r>
-              <w:rPr>
-                <w:rFonts w:ascii="Arial" w:hAnsi="Arial" w:cs="Arial"/>
-                <w:lang w:val="en-US"/>
-              </w:rPr>
               <w:t>Wait for AI player turn</w:t>
             </w:r>
           </w:p>
@@ -2619,21 +2682,12 @@
                 <w:lang w:val="en-US"/>
               </w:rPr>
             </w:pPr>
-            <w:proofErr w:type="gramStart"/>
-            <w:r>
-              <w:rPr>
-                <w:rFonts w:ascii="Arial" w:hAnsi="Arial" w:cs="Arial"/>
-                <w:lang w:val="en-US"/>
-              </w:rPr>
-              <w:t>Test</w:t>
-            </w:r>
-            <w:proofErr w:type="gramEnd"/>
-            <w:r>
-              <w:rPr>
-                <w:rFonts w:ascii="Arial" w:hAnsi="Arial" w:cs="Arial"/>
-                <w:lang w:val="en-US"/>
-              </w:rPr>
-              <w:t xml:space="preserve"> both easy and hard difficulty</w:t>
+            <w:r>
+              <w:rPr>
+                <w:rFonts w:ascii="Arial" w:hAnsi="Arial" w:cs="Arial"/>
+                <w:lang w:val="en-US"/>
+              </w:rPr>
+              <w:t>Test both easy and hard difficulty</w:t>
             </w:r>
           </w:p>
         </w:tc>
@@ -2664,7 +2718,7 @@
         </w:tc>
         <w:tc>
           <w:tcPr>
-            <w:tcW w:w="0" w:type="auto"/>
+            <w:tcW w:w="1435" w:type="dxa"/>
             <w:shd w:val="clear" w:color="auto" w:fill="auto"/>
             <w:vAlign w:val="center"/>
             <w:hideMark/>
@@ -2683,6 +2737,19 @@
               </w:rPr>
               <w:t>Game End Condition</w:t>
             </w:r>
+          </w:p>
+        </w:tc>
+        <w:tc>
+          <w:tcPr>
+            <w:tcW w:w="444" w:type="dxa"/>
+          </w:tcPr>
+          <w:p>
+            <w:pPr>
+              <w:rPr>
+                <w:rFonts w:ascii="Arial" w:hAnsi="Arial" w:cs="Arial"/>
+                <w:lang w:val="en-US"/>
+              </w:rPr>
+            </w:pPr>
           </w:p>
         </w:tc>
         <w:tc>
@@ -2829,7 +2896,7 @@
         </w:tc>
         <w:tc>
           <w:tcPr>
-            <w:tcW w:w="0" w:type="auto"/>
+            <w:tcW w:w="1435" w:type="dxa"/>
             <w:shd w:val="clear" w:color="auto" w:fill="auto"/>
             <w:vAlign w:val="center"/>
             <w:hideMark/>
@@ -2848,6 +2915,19 @@
               </w:rPr>
               <w:t>Time Limit (Abridged Game)</w:t>
             </w:r>
+          </w:p>
+        </w:tc>
+        <w:tc>
+          <w:tcPr>
+            <w:tcW w:w="444" w:type="dxa"/>
+          </w:tcPr>
+          <w:p>
+            <w:pPr>
+              <w:rPr>
+                <w:rFonts w:ascii="Arial" w:hAnsi="Arial" w:cs="Arial"/>
+                <w:lang w:val="en-US"/>
+              </w:rPr>
+            </w:pPr>
           </w:p>
         </w:tc>
         <w:tc>
@@ -2994,10 +3074,23 @@
         </w:tc>
         <w:tc>
           <w:tcPr>
-            <w:tcW w:w="0" w:type="auto"/>
-            <w:shd w:val="clear" w:color="auto" w:fill="auto"/>
-            <w:vAlign w:val="center"/>
-            <w:hideMark/>
+            <w:tcW w:w="1435" w:type="dxa"/>
+            <w:shd w:val="clear" w:color="auto" w:fill="auto"/>
+            <w:vAlign w:val="center"/>
+            <w:hideMark/>
+          </w:tcPr>
+          <w:p>
+            <w:pPr>
+              <w:rPr>
+                <w:rFonts w:ascii="Arial" w:hAnsi="Arial" w:cs="Arial"/>
+                <w:lang w:val="en-US"/>
+              </w:rPr>
+            </w:pPr>
+          </w:p>
+        </w:tc>
+        <w:tc>
+          <w:tcPr>
+            <w:tcW w:w="444" w:type="dxa"/>
           </w:tcPr>
           <w:p>
             <w:pPr>
@@ -3106,13 +3199,7 @@
         </w:tc>
       </w:tr>
     </w:tbl>
-    <w:p>
-      <w:pPr>
-        <w:rPr>
-          <w:rFonts w:hint="eastAsia"/>
-        </w:rPr>
-      </w:pPr>
-    </w:p>
+    <w:p/>
     <w:sectPr>
       <w:pgSz w:w="16838" w:h="11906" w:orient="landscape"/>
       <w:pgMar w:top="720" w:right="720" w:bottom="720" w:left="720" w:header="708" w:footer="708" w:gutter="0"/>
@@ -3122,6 +3209,56 @@
     </w:sectPr>
   </w:body>
 </w:document>
+</file>
+
+<file path=word/endnotes.xml><?xml version="1.0" encoding="utf-8"?>
+<w:endnotes xmlns:wpc="http://schemas.microsoft.com/office/word/2010/wordprocessingCanvas" xmlns:cx="http://schemas.microsoft.com/office/drawing/2014/chartex" xmlns:cx1="http://schemas.microsoft.com/office/drawing/2015/9/8/chartex" xmlns:cx2="http://schemas.microsoft.com/office/drawing/2015/10/21/chartex" xmlns:cx3="http://schemas.microsoft.com/office/drawing/2016/5/9/chartex" xmlns:cx4="http://schemas.microsoft.com/office/drawing/2016/5/10/chartex" xmlns:cx5="http://schemas.microsoft.com/office/drawing/2016/5/11/chartex" xmlns:cx6="http://schemas.microsoft.com/office/drawing/2016/5/12/chartex" xmlns:cx7="http://schemas.microsoft.com/office/drawing/2016/5/13/chartex" xmlns:cx8="http://schemas.microsoft.com/office/drawing/2016/5/14/chartex" xmlns:mc="http://schemas.openxmlformats.org/markup-compatibility/2006" xmlns:aink="http://schemas.microsoft.com/office/drawing/2016/ink" xmlns:am3d="http://schemas.microsoft.com/office/drawing/2017/model3d" xmlns:o="urn:schemas-microsoft-com:office:office" xmlns:oel="http://schemas.microsoft.com/office/2019/extlst" xmlns:r="http://schemas.openxmlformats.org/officeDocument/2006/relationships" xmlns:m="http://schemas.openxmlformats.org/officeDocument/2006/math" xmlns:v="urn:schemas-microsoft-com:vml" xmlns:wp14="http://schemas.microsoft.com/office/word/2010/wordprocessingDrawing" xmlns:wp="http://schemas.openxmlformats.org/drawingml/2006/wordprocessingDrawing" xmlns:w10="urn:schemas-microsoft-com:office:word" xmlns:w="http://schemas.openxmlformats.org/wordprocessingml/2006/main" xmlns:w14="http://schemas.microsoft.com/office/word/2010/wordml" xmlns:w15="http://schemas.microsoft.com/office/word/2012/wordml" xmlns:w16cex="http://schemas.microsoft.com/office/word/2018/wordml/cex" xmlns:w16cid="http://schemas.microsoft.com/office/word/2016/wordml/cid" xmlns:w16="http://schemas.microsoft.com/office/word/2018/wordml" xmlns:w16du="http://schemas.microsoft.com/office/word/2023/wordml/word16du" xmlns:w16sdtdh="http://schemas.microsoft.com/office/word/2020/wordml/sdtdatahash" xmlns:w16sdtfl="http://schemas.microsoft.com/office/word/2024/wordml/sdtformatlock" xmlns:w16se="http://schemas.microsoft.com/office/word/2015/wordml/symex" xmlns:wpg="http://schemas.microsoft.com/office/word/2010/wordprocessingGroup" xmlns:wpi="http://schemas.microsoft.com/office/word/2010/wordprocessingInk" xmlns:wne="http://schemas.microsoft.com/office/word/2006/wordml" xmlns:wps="http://schemas.microsoft.com/office/word/2010/wordprocessingShape" mc:Ignorable="w14 w15 w16se w16cid w16 w16cex w16sdtdh w16sdtfl w16du wp14">
+  <w:endnote w:type="separator" w:id="-1">
+    <w:p>
+      <w:pPr>
+        <w:spacing w:after="0" w:line="240" w:lineRule="auto"/>
+      </w:pPr>
+      <w:r>
+        <w:separator/>
+      </w:r>
+    </w:p>
+  </w:endnote>
+  <w:endnote w:type="continuationSeparator" w:id="0">
+    <w:p>
+      <w:pPr>
+        <w:spacing w:after="0" w:line="240" w:lineRule="auto"/>
+      </w:pPr>
+      <w:r>
+        <w:continuationSeparator/>
+      </w:r>
+    </w:p>
+  </w:endnote>
+</w:endnotes>
+</file>
+
+<file path=word/footnotes.xml><?xml version="1.0" encoding="utf-8"?>
+<w:footnotes xmlns:wpc="http://schemas.microsoft.com/office/word/2010/wordprocessingCanvas" xmlns:cx="http://schemas.microsoft.com/office/drawing/2014/chartex" xmlns:cx1="http://schemas.microsoft.com/office/drawing/2015/9/8/chartex" xmlns:cx2="http://schemas.microsoft.com/office/drawing/2015/10/21/chartex" xmlns:cx3="http://schemas.microsoft.com/office/drawing/2016/5/9/chartex" xmlns:cx4="http://schemas.microsoft.com/office/drawing/2016/5/10/chartex" xmlns:cx5="http://schemas.microsoft.com/office/drawing/2016/5/11/chartex" xmlns:cx6="http://schemas.microsoft.com/office/drawing/2016/5/12/chartex" xmlns:cx7="http://schemas.microsoft.com/office/drawing/2016/5/13/chartex" xmlns:cx8="http://schemas.microsoft.com/office/drawing/2016/5/14/chartex" xmlns:mc="http://schemas.openxmlformats.org/markup-compatibility/2006" xmlns:aink="http://schemas.microsoft.com/office/drawing/2016/ink" xmlns:am3d="http://schemas.microsoft.com/office/drawing/2017/model3d" xmlns:o="urn:schemas-microsoft-com:office:office" xmlns:oel="http://schemas.microsoft.com/office/2019/extlst" xmlns:r="http://schemas.openxmlformats.org/officeDocument/2006/relationships" xmlns:m="http://schemas.openxmlformats.org/officeDocument/2006/math" xmlns:v="urn:schemas-microsoft-com:vml" xmlns:wp14="http://schemas.microsoft.com/office/word/2010/wordprocessingDrawing" xmlns:wp="http://schemas.openxmlformats.org/drawingml/2006/wordprocessingDrawing" xmlns:w10="urn:schemas-microsoft-com:office:word" xmlns:w="http://schemas.openxmlformats.org/wordprocessingml/2006/main" xmlns:w14="http://schemas.microsoft.com/office/word/2010/wordml" xmlns:w15="http://schemas.microsoft.com/office/word/2012/wordml" xmlns:w16cex="http://schemas.microsoft.com/office/word/2018/wordml/cex" xmlns:w16cid="http://schemas.microsoft.com/office/word/2016/wordml/cid" xmlns:w16="http://schemas.microsoft.com/office/word/2018/wordml" xmlns:w16du="http://schemas.microsoft.com/office/word/2023/wordml/word16du" xmlns:w16sdtdh="http://schemas.microsoft.com/office/word/2020/wordml/sdtdatahash" xmlns:w16sdtfl="http://schemas.microsoft.com/office/word/2024/wordml/sdtformatlock" xmlns:w16se="http://schemas.microsoft.com/office/word/2015/wordml/symex" xmlns:wpg="http://schemas.microsoft.com/office/word/2010/wordprocessingGroup" xmlns:wpi="http://schemas.microsoft.com/office/word/2010/wordprocessingInk" xmlns:wne="http://schemas.microsoft.com/office/word/2006/wordml" xmlns:wps="http://schemas.microsoft.com/office/word/2010/wordprocessingShape" mc:Ignorable="w14 w15 w16se w16cid w16 w16cex w16sdtdh w16sdtfl w16du wp14">
+  <w:footnote w:type="separator" w:id="-1">
+    <w:p>
+      <w:pPr>
+        <w:spacing w:after="0" w:line="240" w:lineRule="auto"/>
+      </w:pPr>
+      <w:r>
+        <w:separator/>
+      </w:r>
+    </w:p>
+  </w:footnote>
+  <w:footnote w:type="continuationSeparator" w:id="0">
+    <w:p>
+      <w:pPr>
+        <w:spacing w:after="0" w:line="240" w:lineRule="auto"/>
+      </w:pPr>
+      <w:r>
+        <w:continuationSeparator/>
+      </w:r>
+    </w:p>
+  </w:footnote>
+</w:footnotes>
 </file>
 
 <file path=word/styles.xml><?xml version="1.0" encoding="utf-8"?>
@@ -3786,6 +3923,66 @@
       <w:shd w:val="clear" w:color="auto" w:fill="E1DFDD"/>
     </w:rPr>
   </w:style>
+  <w:style w:type="paragraph" w:styleId="a9">
+    <w:name w:val="header"/>
+    <w:basedOn w:val="a"/>
+    <w:link w:val="aa"/>
+    <w:uiPriority w:val="99"/>
+    <w:unhideWhenUsed/>
+    <w:rsid w:val="00007723"/>
+    <w:pPr>
+      <w:tabs>
+        <w:tab w:val="center" w:pos="4153"/>
+        <w:tab w:val="right" w:pos="8306"/>
+      </w:tabs>
+      <w:snapToGrid w:val="0"/>
+    </w:pPr>
+    <w:rPr>
+      <w:sz w:val="20"/>
+      <w:szCs w:val="20"/>
+    </w:rPr>
+  </w:style>
+  <w:style w:type="character" w:customStyle="1" w:styleId="aa">
+    <w:name w:val="頁首 字元"/>
+    <w:basedOn w:val="a0"/>
+    <w:link w:val="a9"/>
+    <w:uiPriority w:val="99"/>
+    <w:rsid w:val="00007723"/>
+    <w:rPr>
+      <w:sz w:val="20"/>
+      <w:szCs w:val="20"/>
+    </w:rPr>
+  </w:style>
+  <w:style w:type="paragraph" w:styleId="ab">
+    <w:name w:val="footer"/>
+    <w:basedOn w:val="a"/>
+    <w:link w:val="ac"/>
+    <w:uiPriority w:val="99"/>
+    <w:unhideWhenUsed/>
+    <w:rsid w:val="00007723"/>
+    <w:pPr>
+      <w:tabs>
+        <w:tab w:val="center" w:pos="4153"/>
+        <w:tab w:val="right" w:pos="8306"/>
+      </w:tabs>
+      <w:snapToGrid w:val="0"/>
+    </w:pPr>
+    <w:rPr>
+      <w:sz w:val="20"/>
+      <w:szCs w:val="20"/>
+    </w:rPr>
+  </w:style>
+  <w:style w:type="character" w:customStyle="1" w:styleId="ac">
+    <w:name w:val="頁尾 字元"/>
+    <w:basedOn w:val="a0"/>
+    <w:link w:val="ab"/>
+    <w:uiPriority w:val="99"/>
+    <w:rsid w:val="00007723"/>
+    <w:rPr>
+      <w:sz w:val="20"/>
+      <w:szCs w:val="20"/>
+    </w:rPr>
+  </w:style>
 </w:styles>
 </file>
 

</xml_diff>